<commit_message>
Adding Excel notes-01 & 02
</commit_message>
<xml_diff>
--- a/Excel/Excel-Notes-01.docx
+++ b/Excel/Excel-Notes-01.docx
@@ -1025,7 +1025,557 @@
     <w:p>
       <w:pPr>
         <w:rPr>
-          <w:rFonts w:ascii="Sakkal Majalla" w:hAnsi="Sakkal Majalla" w:cs="Sakkal Majalla" w:hint="cs"/>
+          <w:rFonts w:ascii="Sakkal Majalla" w:hAnsi="Sakkal Majalla" w:cs="Sakkal Majalla"/>
+          <w:sz w:val="28"/>
+          <w:szCs w:val="28"/>
+          <w:lang w:bidi="ar-SY"/>
+        </w:rPr>
+      </w:pPr>
+      <w:r>
+        <w:rPr>
+          <w:noProof/>
+        </w:rPr>
+        <w:lastRenderedPageBreak/>
+        <w:drawing>
+          <wp:inline distT="0" distB="0" distL="0" distR="0" wp14:anchorId="54FE36E0" wp14:editId="65D37F84">
+            <wp:extent cx="5943600" cy="4370705"/>
+            <wp:effectExtent l="0" t="0" r="0" b="0"/>
+            <wp:docPr id="84946955" name="Picture 1"/>
+            <wp:cNvGraphicFramePr>
+              <a:graphicFrameLocks xmlns:a="http://schemas.openxmlformats.org/drawingml/2006/main" noChangeAspect="1"/>
+            </wp:cNvGraphicFramePr>
+            <a:graphic xmlns:a="http://schemas.openxmlformats.org/drawingml/2006/main">
+              <a:graphicData uri="http://schemas.openxmlformats.org/drawingml/2006/picture">
+                <pic:pic xmlns:pic="http://schemas.openxmlformats.org/drawingml/2006/picture">
+                  <pic:nvPicPr>
+                    <pic:cNvPr id="84946955" name=""/>
+                    <pic:cNvPicPr/>
+                  </pic:nvPicPr>
+                  <pic:blipFill>
+                    <a:blip r:embed="rId15"/>
+                    <a:stretch>
+                      <a:fillRect/>
+                    </a:stretch>
+                  </pic:blipFill>
+                  <pic:spPr>
+                    <a:xfrm>
+                      <a:off x="0" y="0"/>
+                      <a:ext cx="5943600" cy="4370705"/>
+                    </a:xfrm>
+                    <a:prstGeom prst="rect">
+                      <a:avLst/>
+                    </a:prstGeom>
+                  </pic:spPr>
+                </pic:pic>
+              </a:graphicData>
+            </a:graphic>
+          </wp:inline>
+        </w:drawing>
+      </w:r>
+    </w:p>
+    <w:p>
+      <w:pPr>
+        <w:ind w:left="720" w:firstLine="720"/>
+        <w:rPr>
+          <w:rFonts w:ascii="Sakkal Majalla" w:hAnsi="Sakkal Majalla" w:cs="Sakkal Majalla"/>
+          <w:sz w:val="28"/>
+          <w:szCs w:val="28"/>
+        </w:rPr>
+      </w:pPr>
+      <w:r>
+        <w:rPr>
+          <w:rFonts w:ascii="Sakkal Majalla" w:hAnsi="Sakkal Majalla" w:cs="Sakkal Majalla"/>
+          <w:sz w:val="28"/>
+          <w:szCs w:val="28"/>
+        </w:rPr>
+        <w:t>==========================================================</w:t>
+      </w:r>
+    </w:p>
+    <w:p>
+      <w:pPr>
+        <w:rPr>
+          <w:rFonts w:ascii="Sakkal Majalla" w:hAnsi="Sakkal Majalla" w:cs="Sakkal Majalla"/>
+          <w:sz w:val="28"/>
+          <w:szCs w:val="28"/>
+          <w:lang w:bidi="ar-SY"/>
+        </w:rPr>
+      </w:pPr>
+      <w:r>
+        <w:rPr>
+          <w:noProof/>
+        </w:rPr>
+        <w:drawing>
+          <wp:inline distT="0" distB="0" distL="0" distR="0" wp14:anchorId="1818D653" wp14:editId="2396D5A4">
+            <wp:extent cx="5943600" cy="2777490"/>
+            <wp:effectExtent l="0" t="0" r="0" b="3810"/>
+            <wp:docPr id="1105740731" name="Picture 1"/>
+            <wp:cNvGraphicFramePr>
+              <a:graphicFrameLocks xmlns:a="http://schemas.openxmlformats.org/drawingml/2006/main" noChangeAspect="1"/>
+            </wp:cNvGraphicFramePr>
+            <a:graphic xmlns:a="http://schemas.openxmlformats.org/drawingml/2006/main">
+              <a:graphicData uri="http://schemas.openxmlformats.org/drawingml/2006/picture">
+                <pic:pic xmlns:pic="http://schemas.openxmlformats.org/drawingml/2006/picture">
+                  <pic:nvPicPr>
+                    <pic:cNvPr id="1105740731" name=""/>
+                    <pic:cNvPicPr/>
+                  </pic:nvPicPr>
+                  <pic:blipFill>
+                    <a:blip r:embed="rId16"/>
+                    <a:stretch>
+                      <a:fillRect/>
+                    </a:stretch>
+                  </pic:blipFill>
+                  <pic:spPr>
+                    <a:xfrm>
+                      <a:off x="0" y="0"/>
+                      <a:ext cx="5943600" cy="2777490"/>
+                    </a:xfrm>
+                    <a:prstGeom prst="rect">
+                      <a:avLst/>
+                    </a:prstGeom>
+                  </pic:spPr>
+                </pic:pic>
+              </a:graphicData>
+            </a:graphic>
+          </wp:inline>
+        </w:drawing>
+      </w:r>
+    </w:p>
+    <w:p>
+      <w:pPr>
+        <w:ind w:left="720" w:firstLine="720"/>
+        <w:rPr>
+          <w:rFonts w:ascii="Sakkal Majalla" w:hAnsi="Sakkal Majalla" w:cs="Sakkal Majalla"/>
+          <w:sz w:val="28"/>
+          <w:szCs w:val="28"/>
+        </w:rPr>
+      </w:pPr>
+      <w:r>
+        <w:rPr>
+          <w:rFonts w:ascii="Sakkal Majalla" w:hAnsi="Sakkal Majalla" w:cs="Sakkal Majalla"/>
+          <w:sz w:val="28"/>
+          <w:szCs w:val="28"/>
+        </w:rPr>
+        <w:t>==========================================================</w:t>
+      </w:r>
+    </w:p>
+    <w:p>
+      <w:pPr>
+        <w:jc w:val="center"/>
+        <w:rPr>
+          <w:rFonts w:ascii="Sakkal Majalla" w:hAnsi="Sakkal Majalla" w:cs="Sakkal Majalla"/>
+          <w:sz w:val="28"/>
+          <w:szCs w:val="28"/>
+          <w:lang w:bidi="ar-SY"/>
+        </w:rPr>
+      </w:pPr>
+      <w:r>
+        <w:rPr>
+          <w:noProof/>
+        </w:rPr>
+        <w:lastRenderedPageBreak/>
+        <w:drawing>
+          <wp:inline distT="0" distB="0" distL="0" distR="0" wp14:anchorId="3738C9F1" wp14:editId="6C9A0E9E">
+            <wp:extent cx="5772150" cy="4810125"/>
+            <wp:effectExtent l="0" t="0" r="0" b="9525"/>
+            <wp:docPr id="199994972" name="Picture 1"/>
+            <wp:cNvGraphicFramePr>
+              <a:graphicFrameLocks xmlns:a="http://schemas.openxmlformats.org/drawingml/2006/main" noChangeAspect="1"/>
+            </wp:cNvGraphicFramePr>
+            <a:graphic xmlns:a="http://schemas.openxmlformats.org/drawingml/2006/main">
+              <a:graphicData uri="http://schemas.openxmlformats.org/drawingml/2006/picture">
+                <pic:pic xmlns:pic="http://schemas.openxmlformats.org/drawingml/2006/picture">
+                  <pic:nvPicPr>
+                    <pic:cNvPr id="199994972" name=""/>
+                    <pic:cNvPicPr/>
+                  </pic:nvPicPr>
+                  <pic:blipFill>
+                    <a:blip r:embed="rId17"/>
+                    <a:stretch>
+                      <a:fillRect/>
+                    </a:stretch>
+                  </pic:blipFill>
+                  <pic:spPr>
+                    <a:xfrm>
+                      <a:off x="0" y="0"/>
+                      <a:ext cx="5772150" cy="4810125"/>
+                    </a:xfrm>
+                    <a:prstGeom prst="rect">
+                      <a:avLst/>
+                    </a:prstGeom>
+                  </pic:spPr>
+                </pic:pic>
+              </a:graphicData>
+            </a:graphic>
+          </wp:inline>
+        </w:drawing>
+      </w:r>
+    </w:p>
+    <w:p>
+      <w:pPr>
+        <w:ind w:left="720" w:firstLine="720"/>
+        <w:rPr>
+          <w:rFonts w:ascii="Sakkal Majalla" w:hAnsi="Sakkal Majalla" w:cs="Sakkal Majalla"/>
+          <w:sz w:val="28"/>
+          <w:szCs w:val="28"/>
+        </w:rPr>
+      </w:pPr>
+      <w:r>
+        <w:rPr>
+          <w:rFonts w:ascii="Sakkal Majalla" w:hAnsi="Sakkal Majalla" w:cs="Sakkal Majalla"/>
+          <w:sz w:val="28"/>
+          <w:szCs w:val="28"/>
+        </w:rPr>
+        <w:t>==========================================================</w:t>
+      </w:r>
+    </w:p>
+    <w:p>
+      <w:pPr>
+        <w:rPr>
+          <w:rFonts w:ascii="Sakkal Majalla" w:hAnsi="Sakkal Majalla" w:cs="Sakkal Majalla"/>
+          <w:sz w:val="28"/>
+          <w:szCs w:val="28"/>
+          <w:lang w:bidi="ar-SY"/>
+        </w:rPr>
+      </w:pPr>
+      <w:r>
+        <w:rPr>
+          <w:noProof/>
+        </w:rPr>
+        <w:lastRenderedPageBreak/>
+        <w:drawing>
+          <wp:inline distT="0" distB="0" distL="0" distR="0" wp14:anchorId="76EA5CD1" wp14:editId="3E05F1DD">
+            <wp:extent cx="6639560" cy="4219575"/>
+            <wp:effectExtent l="0" t="0" r="8890" b="9525"/>
+            <wp:docPr id="1625983431" name="Picture 1"/>
+            <wp:cNvGraphicFramePr>
+              <a:graphicFrameLocks xmlns:a="http://schemas.openxmlformats.org/drawingml/2006/main" noChangeAspect="1"/>
+            </wp:cNvGraphicFramePr>
+            <a:graphic xmlns:a="http://schemas.openxmlformats.org/drawingml/2006/main">
+              <a:graphicData uri="http://schemas.openxmlformats.org/drawingml/2006/picture">
+                <pic:pic xmlns:pic="http://schemas.openxmlformats.org/drawingml/2006/picture">
+                  <pic:nvPicPr>
+                    <pic:cNvPr id="1625983431" name=""/>
+                    <pic:cNvPicPr/>
+                  </pic:nvPicPr>
+                  <pic:blipFill>
+                    <a:blip r:embed="rId18"/>
+                    <a:stretch>
+                      <a:fillRect/>
+                    </a:stretch>
+                  </pic:blipFill>
+                  <pic:spPr>
+                    <a:xfrm>
+                      <a:off x="0" y="0"/>
+                      <a:ext cx="6648433" cy="4225214"/>
+                    </a:xfrm>
+                    <a:prstGeom prst="rect">
+                      <a:avLst/>
+                    </a:prstGeom>
+                  </pic:spPr>
+                </pic:pic>
+              </a:graphicData>
+            </a:graphic>
+          </wp:inline>
+        </w:drawing>
+      </w:r>
+    </w:p>
+    <w:p>
+      <w:pPr>
+        <w:ind w:left="720" w:firstLine="720"/>
+        <w:rPr>
+          <w:rFonts w:ascii="Sakkal Majalla" w:hAnsi="Sakkal Majalla" w:cs="Sakkal Majalla"/>
+          <w:sz w:val="28"/>
+          <w:szCs w:val="28"/>
+        </w:rPr>
+      </w:pPr>
+      <w:r>
+        <w:rPr>
+          <w:rFonts w:ascii="Sakkal Majalla" w:hAnsi="Sakkal Majalla" w:cs="Sakkal Majalla"/>
+          <w:sz w:val="28"/>
+          <w:szCs w:val="28"/>
+        </w:rPr>
+        <w:t>==========================================================</w:t>
+      </w:r>
+    </w:p>
+    <w:p>
+      <w:pPr>
+        <w:rPr>
+          <w:rFonts w:ascii="Sakkal Majalla" w:hAnsi="Sakkal Majalla" w:cs="Sakkal Majalla"/>
+          <w:sz w:val="28"/>
+          <w:szCs w:val="28"/>
+          <w:lang w:bidi="ar-SY"/>
+        </w:rPr>
+      </w:pPr>
+      <w:r>
+        <w:rPr>
+          <w:noProof/>
+        </w:rPr>
+        <w:lastRenderedPageBreak/>
+        <w:drawing>
+          <wp:inline distT="0" distB="0" distL="0" distR="0" wp14:anchorId="4DB4AD3D" wp14:editId="6DB370F7">
+            <wp:extent cx="6657023" cy="3543300"/>
+            <wp:effectExtent l="0" t="0" r="0" b="0"/>
+            <wp:docPr id="337575663" name="Picture 1"/>
+            <wp:cNvGraphicFramePr>
+              <a:graphicFrameLocks xmlns:a="http://schemas.openxmlformats.org/drawingml/2006/main" noChangeAspect="1"/>
+            </wp:cNvGraphicFramePr>
+            <a:graphic xmlns:a="http://schemas.openxmlformats.org/drawingml/2006/main">
+              <a:graphicData uri="http://schemas.openxmlformats.org/drawingml/2006/picture">
+                <pic:pic xmlns:pic="http://schemas.openxmlformats.org/drawingml/2006/picture">
+                  <pic:nvPicPr>
+                    <pic:cNvPr id="337575663" name=""/>
+                    <pic:cNvPicPr/>
+                  </pic:nvPicPr>
+                  <pic:blipFill>
+                    <a:blip r:embed="rId19"/>
+                    <a:stretch>
+                      <a:fillRect/>
+                    </a:stretch>
+                  </pic:blipFill>
+                  <pic:spPr>
+                    <a:xfrm>
+                      <a:off x="0" y="0"/>
+                      <a:ext cx="6667333" cy="3548788"/>
+                    </a:xfrm>
+                    <a:prstGeom prst="rect">
+                      <a:avLst/>
+                    </a:prstGeom>
+                  </pic:spPr>
+                </pic:pic>
+              </a:graphicData>
+            </a:graphic>
+          </wp:inline>
+        </w:drawing>
+      </w:r>
+    </w:p>
+    <w:p>
+      <w:pPr>
+        <w:ind w:left="720" w:firstLine="720"/>
+        <w:rPr>
+          <w:rFonts w:ascii="Sakkal Majalla" w:hAnsi="Sakkal Majalla" w:cs="Sakkal Majalla"/>
+          <w:sz w:val="28"/>
+          <w:szCs w:val="28"/>
+        </w:rPr>
+      </w:pPr>
+      <w:r>
+        <w:rPr>
+          <w:rFonts w:ascii="Sakkal Majalla" w:hAnsi="Sakkal Majalla" w:cs="Sakkal Majalla"/>
+          <w:sz w:val="28"/>
+          <w:szCs w:val="28"/>
+        </w:rPr>
+        <w:t>==========================================================</w:t>
+      </w:r>
+    </w:p>
+    <w:p>
+      <w:pPr>
+        <w:rPr>
+          <w:rFonts w:ascii="Sakkal Majalla" w:hAnsi="Sakkal Majalla" w:cs="Sakkal Majalla"/>
+          <w:sz w:val="28"/>
+          <w:szCs w:val="28"/>
+          <w:lang w:bidi="ar-SY"/>
+        </w:rPr>
+      </w:pPr>
+      <w:r>
+        <w:rPr>
+          <w:noProof/>
+        </w:rPr>
+        <w:drawing>
+          <wp:inline distT="0" distB="0" distL="0" distR="0" wp14:anchorId="488D416E" wp14:editId="105DA421">
+            <wp:extent cx="6647815" cy="3695700"/>
+            <wp:effectExtent l="0" t="0" r="635" b="0"/>
+            <wp:docPr id="273259613" name="Picture 1"/>
+            <wp:cNvGraphicFramePr>
+              <a:graphicFrameLocks xmlns:a="http://schemas.openxmlformats.org/drawingml/2006/main" noChangeAspect="1"/>
+            </wp:cNvGraphicFramePr>
+            <a:graphic xmlns:a="http://schemas.openxmlformats.org/drawingml/2006/main">
+              <a:graphicData uri="http://schemas.openxmlformats.org/drawingml/2006/picture">
+                <pic:pic xmlns:pic="http://schemas.openxmlformats.org/drawingml/2006/picture">
+                  <pic:nvPicPr>
+                    <pic:cNvPr id="273259613" name=""/>
+                    <pic:cNvPicPr/>
+                  </pic:nvPicPr>
+                  <pic:blipFill>
+                    <a:blip r:embed="rId20"/>
+                    <a:stretch>
+                      <a:fillRect/>
+                    </a:stretch>
+                  </pic:blipFill>
+                  <pic:spPr>
+                    <a:xfrm>
+                      <a:off x="0" y="0"/>
+                      <a:ext cx="6652765" cy="3698452"/>
+                    </a:xfrm>
+                    <a:prstGeom prst="rect">
+                      <a:avLst/>
+                    </a:prstGeom>
+                  </pic:spPr>
+                </pic:pic>
+              </a:graphicData>
+            </a:graphic>
+          </wp:inline>
+        </w:drawing>
+      </w:r>
+    </w:p>
+    <w:p>
+      <w:pPr>
+        <w:ind w:left="720" w:firstLine="720"/>
+        <w:rPr>
+          <w:rFonts w:ascii="Sakkal Majalla" w:hAnsi="Sakkal Majalla" w:cs="Sakkal Majalla"/>
+          <w:sz w:val="28"/>
+          <w:szCs w:val="28"/>
+        </w:rPr>
+      </w:pPr>
+      <w:r>
+        <w:rPr>
+          <w:rFonts w:ascii="Sakkal Majalla" w:hAnsi="Sakkal Majalla" w:cs="Sakkal Majalla"/>
+          <w:sz w:val="28"/>
+          <w:szCs w:val="28"/>
+        </w:rPr>
+        <w:t>==========================================================</w:t>
+      </w:r>
+    </w:p>
+    <w:p>
+      <w:pPr>
+        <w:rPr>
+          <w:rFonts w:ascii="Sakkal Majalla" w:hAnsi="Sakkal Majalla" w:cs="Sakkal Majalla"/>
+          <w:sz w:val="28"/>
+          <w:szCs w:val="28"/>
+          <w:lang w:bidi="ar-SY"/>
+        </w:rPr>
+      </w:pPr>
+      <w:r>
+        <w:rPr>
+          <w:noProof/>
+        </w:rPr>
+        <w:lastRenderedPageBreak/>
+        <w:drawing>
+          <wp:inline distT="0" distB="0" distL="0" distR="0" wp14:anchorId="299244DB" wp14:editId="3368FA10">
+            <wp:extent cx="6639697" cy="3543300"/>
+            <wp:effectExtent l="0" t="0" r="8890" b="0"/>
+            <wp:docPr id="505702326" name="Picture 1"/>
+            <wp:cNvGraphicFramePr>
+              <a:graphicFrameLocks xmlns:a="http://schemas.openxmlformats.org/drawingml/2006/main" noChangeAspect="1"/>
+            </wp:cNvGraphicFramePr>
+            <a:graphic xmlns:a="http://schemas.openxmlformats.org/drawingml/2006/main">
+              <a:graphicData uri="http://schemas.openxmlformats.org/drawingml/2006/picture">
+                <pic:pic xmlns:pic="http://schemas.openxmlformats.org/drawingml/2006/picture">
+                  <pic:nvPicPr>
+                    <pic:cNvPr id="505702326" name=""/>
+                    <pic:cNvPicPr/>
+                  </pic:nvPicPr>
+                  <pic:blipFill>
+                    <a:blip r:embed="rId21"/>
+                    <a:stretch>
+                      <a:fillRect/>
+                    </a:stretch>
+                  </pic:blipFill>
+                  <pic:spPr>
+                    <a:xfrm>
+                      <a:off x="0" y="0"/>
+                      <a:ext cx="6643918" cy="3545553"/>
+                    </a:xfrm>
+                    <a:prstGeom prst="rect">
+                      <a:avLst/>
+                    </a:prstGeom>
+                  </pic:spPr>
+                </pic:pic>
+              </a:graphicData>
+            </a:graphic>
+          </wp:inline>
+        </w:drawing>
+      </w:r>
+    </w:p>
+    <w:p>
+      <w:pPr>
+        <w:ind w:left="720" w:firstLine="720"/>
+        <w:rPr>
+          <w:rFonts w:ascii="Sakkal Majalla" w:hAnsi="Sakkal Majalla" w:cs="Sakkal Majalla"/>
+          <w:sz w:val="28"/>
+          <w:szCs w:val="28"/>
+        </w:rPr>
+      </w:pPr>
+      <w:r>
+        <w:rPr>
+          <w:rFonts w:ascii="Sakkal Majalla" w:hAnsi="Sakkal Majalla" w:cs="Sakkal Majalla"/>
+          <w:sz w:val="28"/>
+          <w:szCs w:val="28"/>
+        </w:rPr>
+        <w:t>==========================================================</w:t>
+      </w:r>
+    </w:p>
+    <w:p>
+      <w:pPr>
+        <w:rPr>
+          <w:rFonts w:ascii="Sakkal Majalla" w:hAnsi="Sakkal Majalla" w:cs="Sakkal Majalla"/>
+          <w:sz w:val="28"/>
+          <w:szCs w:val="28"/>
+          <w:lang w:bidi="ar-SY"/>
+        </w:rPr>
+      </w:pPr>
+      <w:r>
+        <w:rPr>
+          <w:noProof/>
+        </w:rPr>
+        <w:drawing>
+          <wp:inline distT="0" distB="0" distL="0" distR="0" wp14:anchorId="5E913F81" wp14:editId="105FBE90">
+            <wp:extent cx="6594758" cy="3524250"/>
+            <wp:effectExtent l="0" t="0" r="0" b="0"/>
+            <wp:docPr id="1124412174" name="Picture 1"/>
+            <wp:cNvGraphicFramePr>
+              <a:graphicFrameLocks xmlns:a="http://schemas.openxmlformats.org/drawingml/2006/main" noChangeAspect="1"/>
+            </wp:cNvGraphicFramePr>
+            <a:graphic xmlns:a="http://schemas.openxmlformats.org/drawingml/2006/main">
+              <a:graphicData uri="http://schemas.openxmlformats.org/drawingml/2006/picture">
+                <pic:pic xmlns:pic="http://schemas.openxmlformats.org/drawingml/2006/picture">
+                  <pic:nvPicPr>
+                    <pic:cNvPr id="1124412174" name=""/>
+                    <pic:cNvPicPr/>
+                  </pic:nvPicPr>
+                  <pic:blipFill>
+                    <a:blip r:embed="rId22"/>
+                    <a:stretch>
+                      <a:fillRect/>
+                    </a:stretch>
+                  </pic:blipFill>
+                  <pic:spPr>
+                    <a:xfrm>
+                      <a:off x="0" y="0"/>
+                      <a:ext cx="6599948" cy="3527024"/>
+                    </a:xfrm>
+                    <a:prstGeom prst="rect">
+                      <a:avLst/>
+                    </a:prstGeom>
+                  </pic:spPr>
+                </pic:pic>
+              </a:graphicData>
+            </a:graphic>
+          </wp:inline>
+        </w:drawing>
+      </w:r>
+    </w:p>
+    <w:p>
+      <w:pPr>
+        <w:ind w:left="720" w:firstLine="720"/>
+        <w:rPr>
+          <w:rFonts w:ascii="Sakkal Majalla" w:hAnsi="Sakkal Majalla" w:cs="Sakkal Majalla"/>
+          <w:sz w:val="28"/>
+          <w:szCs w:val="28"/>
+        </w:rPr>
+      </w:pPr>
+      <w:r>
+        <w:rPr>
+          <w:rFonts w:ascii="Sakkal Majalla" w:hAnsi="Sakkal Majalla" w:cs="Sakkal Majalla"/>
+          <w:sz w:val="28"/>
+          <w:szCs w:val="28"/>
+        </w:rPr>
+        <w:t>==========================================================</w:t>
+      </w:r>
+    </w:p>
+    <w:p>
+      <w:pPr>
+        <w:rPr>
+          <w:rFonts w:ascii="Sakkal Majalla" w:hAnsi="Sakkal Majalla" w:cs="Sakkal Majalla"/>
           <w:sz w:val="28"/>
           <w:szCs w:val="28"/>
           <w:rtl/>

</xml_diff>

<commit_message>
Adding VLoopkUp & HLookUp & XLookUp notes
</commit_message>
<xml_diff>
--- a/Excel/Excel-Notes-01.docx
+++ b/Excel/Excel-Notes-01.docx
@@ -1039,6 +1039,69 @@
         <w:t>================================================</w:t>
       </w:r>
     </w:p>
+    <w:p>
+      <w:r>
+        <w:lastRenderedPageBreak/>
+        <w:t>To insert a chart and change the style from the Chart Design tab:</w:t>
+      </w:r>
+    </w:p>
+    <w:p>
+      <w:r>
+        <w:rPr>
+          <w:noProof/>
+        </w:rPr>
+        <w:drawing>
+          <wp:inline distT="0" distB="0" distL="0" distR="0" wp14:anchorId="6B05E47F" wp14:editId="063F28F4">
+            <wp:extent cx="5943600" cy="3176270"/>
+            <wp:effectExtent l="0" t="0" r="0" b="5080"/>
+            <wp:docPr id="839579922" name="Picture 1"/>
+            <wp:cNvGraphicFramePr>
+              <a:graphicFrameLocks xmlns:a="http://schemas.openxmlformats.org/drawingml/2006/main" noChangeAspect="1"/>
+            </wp:cNvGraphicFramePr>
+            <a:graphic xmlns:a="http://schemas.openxmlformats.org/drawingml/2006/main">
+              <a:graphicData uri="http://schemas.openxmlformats.org/drawingml/2006/picture">
+                <pic:pic xmlns:pic="http://schemas.openxmlformats.org/drawingml/2006/picture">
+                  <pic:nvPicPr>
+                    <pic:cNvPr id="839579922" name="Picture 839579922"/>
+                    <pic:cNvPicPr/>
+                  </pic:nvPicPr>
+                  <pic:blipFill>
+                    <a:blip r:embed="rId20">
+                      <a:extLst>
+                        <a:ext uri="{28A0092B-C50C-407E-A947-70E740481C1C}">
+                          <a14:useLocalDpi xmlns:a14="http://schemas.microsoft.com/office/drawing/2010/main" val="0"/>
+                        </a:ext>
+                      </a:extLst>
+                    </a:blip>
+                    <a:stretch>
+                      <a:fillRect/>
+                    </a:stretch>
+                  </pic:blipFill>
+                  <pic:spPr>
+                    <a:xfrm>
+                      <a:off x="0" y="0"/>
+                      <a:ext cx="5943600" cy="3176270"/>
+                    </a:xfrm>
+                    <a:prstGeom prst="rect">
+                      <a:avLst/>
+                    </a:prstGeom>
+                  </pic:spPr>
+                </pic:pic>
+              </a:graphicData>
+            </a:graphic>
+          </wp:inline>
+        </w:drawing>
+      </w:r>
+    </w:p>
+    <w:p>
+      <w:pPr>
+        <w:ind w:left="720" w:firstLine="720"/>
+      </w:pPr>
+      <w:r>
+        <w:t>================================================</w:t>
+      </w:r>
+    </w:p>
+    <w:p/>
     <w:sectPr>
       <w:pgSz w:w="12240" w:h="15840"/>
       <w:pgMar w:top="1440" w:right="1440" w:bottom="1440" w:left="1440" w:header="708" w:footer="708" w:gutter="0"/>

</xml_diff>

<commit_message>
Adding Excel Chart simple Notes
</commit_message>
<xml_diff>
--- a/Excel/Excel-Notes-01.docx
+++ b/Excel/Excel-Notes-01.docx
@@ -1051,9 +1051,9 @@
           <w:noProof/>
         </w:rPr>
         <w:drawing>
-          <wp:inline distT="0" distB="0" distL="0" distR="0" wp14:anchorId="6B05E47F" wp14:editId="063F28F4">
-            <wp:extent cx="5943600" cy="3176270"/>
-            <wp:effectExtent l="0" t="0" r="0" b="5080"/>
+          <wp:inline distT="0" distB="0" distL="0" distR="0" wp14:anchorId="6B05E47F" wp14:editId="63681AE1">
+            <wp:extent cx="6715959" cy="3589020"/>
+            <wp:effectExtent l="0" t="0" r="8890" b="0"/>
             <wp:docPr id="839579922" name="Picture 1"/>
             <wp:cNvGraphicFramePr>
               <a:graphicFrameLocks xmlns:a="http://schemas.openxmlformats.org/drawingml/2006/main" noChangeAspect="1"/>
@@ -1080,7 +1080,7 @@
                   <pic:spPr>
                     <a:xfrm>
                       <a:off x="0" y="0"/>
-                      <a:ext cx="5943600" cy="3176270"/>
+                      <a:ext cx="6722019" cy="3592259"/>
                     </a:xfrm>
                     <a:prstGeom prst="rect">
                       <a:avLst/>

</xml_diff>